<commit_message>
Update IEC visual: new version with open Q3 torus
Co-Authored-By: Claude Opus 4.6 (1M context) <noreply@anthropic.com>
</commit_message>
<xml_diff>
--- a/papers/TFP_Paper5_Flagship.docx
+++ b/papers/TFP_Paper5_Flagship.docx
@@ -253,14 +253,13 @@
     </w:p>
     <w:p>
       <w:pPr>
-        <w:spacing w:before="120" w:after="40"/>
         <w:jc w:val="center"/>
       </w:pPr>
       <w:r>
         <w:drawing>
           <wp:inline xmlns:a="http://schemas.openxmlformats.org/drawingml/2006/main" xmlns:pic="http://schemas.openxmlformats.org/drawingml/2006/picture">
             <wp:extent cx="4114800" cy="4114800"/>
-            <wp:docPr id="1" name="Picture 1"/>
+            <wp:docPr id="6" name="Picture 6"/>
             <wp:cNvGraphicFramePr>
               <a:graphicFrameLocks noChangeAspect="1"/>
             </wp:cNvGraphicFramePr>
@@ -272,7 +271,7 @@
                     <pic:cNvPicPr/>
                   </pic:nvPicPr>
                   <pic:blipFill>
-                    <a:blip r:embed="rId9"/>
+                    <a:blip r:embed="rId15"/>
                     <a:stretch>
                       <a:fillRect/>
                     </a:stretch>

</xml_diff>